<commit_message>
updated form students in templates
</commit_message>
<xml_diff>
--- a/src/main/resources/templates/bachelors/4th_course/piikn/Бакалавриат_Задание_на_ВКР_ПИиКН.docx
+++ b/src/main/resources/templates/bachelors/4th_course/piikn/Бакалавриат_Задание_на_ВКР_ПИиКН.docx
@@ -317,10 +317,7 @@
           </w:tcPr>
           <w:p>
             <w:r>
-              <w:t>формаСтудента</w:t>
-            </w:r>
-            <w:r>
-              <w:t>Дат</w:t>
+              <w:t>формаСтудентаДат</w:t>
             </w:r>
             <w:r>
               <w:t xml:space="preserve"> </w:t>

</xml_diff>